<commit_message>
feat: terminologia Asignatura+Grupo, soporte multi-cohorte (ISO 21001)
</commit_message>
<xml_diff>
--- a/uploads/FIS301 - Fisica Cuantica Aplicada-REV/documentos/CARPETA_PEDAGOGICA_CONSOLIDADA_FIS301_-_Fisica_Cuantica_Aplicada.docx
+++ b/uploads/FIS301 - Fisica Cuantica Aplicada-REV/documentos/CARPETA_PEDAGOGICA_CONSOLIDADA_FIS301_-_Fisica_Cuantica_Aplicada.docx
@@ -361,27 +361,27 @@
         <w:br/>
       </w:r>
       <w:r>
-        <w:t>• Promedio General de Rendimiento: 76.7 / 100 (Mediana: 76.8, Desviación Estándar Muestral: 7.1).</w:t>
+        <w:t>• Promedio General de Rendimiento: 77.4 / 100 (Mediana: 70.0, Desviación Estándar Muestral: 6.8).</w:t>
         <w:br/>
       </w:r>
       <w:r>
-        <w:t>• Coeficiente de Asimetría (Fisher-Pearson g1 = -0.15): Distribución Cuasi-Simétrica: Calificaciones balanceadas..</w:t>
+        <w:t>• Coeficiente de Asimetría (Fisher-Pearson g1 = 0): Distribución equilibrada.</w:t>
         <w:br/>
       </w:r>
       <w:r>
-        <w:t>• Alertas de Outsourcing Cognitivo Detectadas: 0 estudiantes con alto puntaje pero nula evidencia de iteración reflexiva.</w:t>
+        <w:t>• Alertas de Outsourcing Cognitivo Detectadas: 4 estudiantes con alto puntaje pero nula evidencia de iteración reflexiva.</w:t>
         <w:br/>
       </w:r>
       <w:r>
-        <w:t>• Casos en Riesgo de Rezago Prioritario: 0 estudiantes clasificados para andamiaje urgente.</w:t>
+        <w:t>• Casos en Riesgo de Rezago Prioritario: 2 estudiantes clasificados para andamiaje urgente.</w:t>
         <w:br/>
       </w:r>
       <w:r>
-        <w:t>• Zona de Desarrollo Próximo (Vygotsky): 0 estudiantes requieren andamiaje urgente; 3 con potencial oculto detectado..</w:t>
+        <w:t>• Zona de Desarrollo Próximo (Vygotsky): La Zona de Desarrollo Próximo (ZDP) del grupo evidencia una brecha entre la ejecución algorítmica superficial asistida por IA y la comprensión conceptual profunda de los principios cuánticos. Se requiere un andamiaje que desacople el uso de la herramienta de la automatización pasiva, fomentando la metacognición y el debate socrático en el aula..</w:t>
         <w:br/>
       </w:r>
       <w:r>
-        <w:t>• Teoría de Autodeterminación (Deci &amp; Ryan): Autonomía=7.5/10, Competencia=7.2/10, Relación=7.3/10.</w:t>
+        <w:t>• Teoría de Autodeterminación (Deci &amp; Ryan): Autonomía=7.8/10, Competencia=7.2/10, Relación=7.5/10.</w:t>
       </w:r>
     </w:p>
     <w:p/>

</xml_diff>